<commit_message>
Evolution: series is Physics, Actually (KDP series line, title-page and copyright series line); rebuild master
</commit_message>
<xml_diff>
--- a/Evolution/Life - Science for Everyone - Full Manuscript.docx
+++ b/Evolution/Life - Science for Everyone - Full Manuscript.docx
@@ -4,6 +4,20 @@
   <w:body>
     <w:p>
       <w:pPr>
+        <w:ind w:left="0" w:right="0" w:firstLine="0"/>
+        <w:jc w:val="center"/>
+      </w:pPr>
+      <w:r>
+        <w:rPr>
+          <w:rFonts w:ascii="Amazon Ember" w:hAnsi="Amazon Ember" w:cs="Amazon Ember"/>
+          <w:b/>
+          <w:color w:val="0000FF"/>
+        </w:rPr>
+        <w:t>Physics, Actually</w:t>
+      </w:r>
+    </w:p>
+    <w:p>
+      <w:pPr>
         <w:pStyle w:val="Title"/>
         <w:ind w:left="0" w:right="0" w:firstLine="0"/>
         <w:jc w:val="center"/>
@@ -51,6 +65,15 @@
       </w:pPr>
       <w:r>
         <w:t>All rights reserved.</w:t>
+      </w:r>
+    </w:p>
+    <w:p>
+      <w:pPr>
+        <w:ind w:left="0" w:right="0" w:firstLine="0"/>
+        <w:jc w:val="center"/>
+      </w:pPr>
+      <w:r>
+        <w:t>Series: Physics, Actually</w:t>
       </w:r>
     </w:p>
     <w:p>

</xml_diff>